<commit_message>
Revert URL change: keep basepulse.manus.space as-is
Co-authored-by: Abuchtela <84213452+Abuchtela@users.noreply.github.com>
</commit_message>
<xml_diff>
--- a/docs/BaseBatches_Application.docx
+++ b/docs/BaseBatches_Application.docx
@@ -27,7 +27,7 @@
           <w:color w:val="505050"/>
           <w:sz w:val="24"/>
         </w:rPr>
-        <w:t>Submitted by: BasePulse  |  https://base.manus.space</w:t>
+        <w:t>Submitted by: BasePulse  |  https://basepulse.manus.space</w:t>
       </w:r>
     </w:p>
     <w:p/>
@@ -136,7 +136,7 @@
           <w:i w:val="0"/>
           <w:sz w:val="22"/>
         </w:rPr>
-        <w:t>https://base.manus.space</w:t>
+        <w:t>https://basepulse.manus.space</w:t>
       </w:r>
     </w:p>
     <w:p>
@@ -178,7 +178,7 @@
           <w:i w:val="0"/>
           <w:sz w:val="22"/>
         </w:rPr>
-        <w:t>https://base.manus.space/dashboard</w:t>
+        <w:t>https://basepulse.manus.space/dashboard</w:t>
       </w:r>
     </w:p>
     <w:p>
@@ -779,7 +779,7 @@
           <w:i w:val="0"/>
           <w:sz w:val="22"/>
         </w:rPr>
-        <w:t>BasePulse is currently in MVP/beta phase. The dashboard is publicly accessible at https://base.manus.space and authenticated users can observe live agent activity. There are no paying customers at this stage. Traction is being built through the Base ecosystem community and the Base Build competition. User growth is a primary focus post-Base Batches acceptance.</w:t>
+        <w:t>BasePulse is currently in MVP/beta phase. The dashboard is publicly accessible at https://basepulse.manus.space and authenticated users can observe live agent activity. There are no paying customers at this stage. Traction is being built through the Base ecosystem community and the Base Build competition. User growth is a primary focus post-Base Batches acceptance.</w:t>
       </w:r>
     </w:p>
     <w:p>
@@ -833,7 +833,7 @@
           <w:i w:val="0"/>
           <w:sz w:val="22"/>
         </w:rPr>
-        <w:t>Token deployments are tracked in the live dashboard at https://base.manus.space/dashboard and recorded on-chain via Clanker SDK and Coinbase CDP SDK on Base mainnet. Formal Dune Analytics dashboards are in preparation. Public smart contract addresses from production deployments will be shared as they are generated. GitHub repository: https://github.com/Abuchtela/BasePulse</w:t>
+        <w:t>Token deployments are tracked in the live dashboard at https://basepulse.manus.space/dashboard and recorded on-chain via Clanker SDK and Coinbase CDP SDK on Base mainnet. Formal Dune Analytics dashboards are in preparation. Public smart contract addresses from production deployments will be shared as they are generated. GitHub repository: https://github.com/Abuchtela/BasePulse</w:t>
       </w:r>
     </w:p>
     <w:p>

</xml_diff>